<commit_message>
docs: sync innovation-full with user's abstract edits (BLS BKK + 10-month timeline)
Applies user's abstract edits to gen-full.js so innovation-full.docx matches:

- Classify The Good Ambulance as BLS (หน่วยปฏิบัติการแพทย์ระดับพื้นฐาน) in Bangkok,
  alongside Supwilai Medical as ALS in Nakhon Sawan. Updates Ch 1.3 scope.
- Realign Ch 4 (ผลการดำเนินงาน) and Ch 5 (สรุป/ข้อจำกัด) with the abstract's
  10-month timeline (มี.ค.–ธ.ค. 2569), replacing the prior 3-week pilot numbers
  (30 transport / 17 first-aid events / 74 patients / 5 consents / 60 sheets)
  with [___] placeholders. Narrative reframes expectations rather than reporting
  completed data, since the period ends Dec 2569.
- gen-abstract.js source also synced to match user's docx edits so future
  regenerations don't regress (BLS/BKK text + keyword).

abstract.docx itself is left as edited by the user — only regenerates
innovation-full.docx (25 KB).

Co-Authored-By: Claude Opus 4.6 <noreply@anthropic.com>
</commit_message>
<xml_diff>
--- a/docs/innovation-full.docx
+++ b/docs/innovation-full.docx
@@ -488,7 +488,7 @@
           <w:sz w:val="32"/>
           <w:szCs w:val="32"/>
         </w:rPr>
-        <w:t xml:space="preserve">ทดสอบใช้งานจริงใน 2 หน่วยปฏิบัติการแพทย์ภาคเอกชน ได้แก่ (1) บริษัท ทรัพย์วิไล เมดิคอล จำกัด ซึ่งได้รับอนุมัติเป็นหน่วยปฏิบัติการแพทย์ระดับสูง (ALS) ในพื้นที่จังหวัดนครสวรรค์ ให้บริการลำเลียง/ส่งต่อผู้ป่วย ปฐมพยาบาล และตอบสนองเหตุฉุกเฉินตามชุดโปรโตคอลภายใน 3 ฉบับ (Protocol EMS, Protocol First Aid, Protocol Refer) และ (2) The Good Ambulance (รถพยาบาลส่งต่อและตอบสนองเหตุฉุกเฉิน) ระยะดำเนินงานในเวอร์ชันที่เสนอบทความนี้อยู่ระหว่างเดือนมีนาคม–ธันวาคม 2569 รวมระยะเวลา 10 เดือน ครอบคลุมงาน Transport/Referral, First Aid, Emergency Response, Digital Consent, Location Tracking, บันทึกปฏิบัติการประจำตัวผู้ปฏิบัติการ, ใบรายงานอุบัติการณ์ดิจิทัล และ Real-time Monitor Dashboard</w:t>
+        <w:t xml:space="preserve">ทดสอบใช้งานจริงใน 2 หน่วยปฏิบัติการแพทย์ภาคเอกชน ได้แก่ (1) บริษัท ทรัพย์วิไล เมดิคอล จำกัด ซึ่งได้รับอนุมัติเป็นหน่วยปฏิบัติการแพทย์ระดับสูง (ALS) ในพื้นที่จังหวัดนครสวรรค์ ให้บริการลำเลียง/ส่งต่อผู้ป่วย ปฐมพยาบาล และตอบสนองเหตุฉุกเฉินตามชุดโปรโตคอลภายใน 3 ฉบับ (Protocol EMS, Protocol First Aid, Protocol Refer) และ (2) The Good Ambulance ซึ่งได้รับอนุมัติเป็นหน่วยปฏิบัติการแพทย์ระดับพื้นฐาน (BLS) ในพื้นที่กรุงเทพมหานคร ระยะดำเนินงานในเวอร์ชันที่เสนอบทความนี้อยู่ระหว่างเดือนมีนาคม–ธันวาคม 2569 รวมระยะเวลา 10 เดือน ครอบคลุมงาน Transport/Referral, First Aid, Emergency Response, Digital Consent, Location Tracking, บันทึกปฏิบัติการประจำตัวผู้ปฏิบัติการ, ใบรายงานอุบัติการณ์ดิจิทัล และ Real-time Monitor Dashboard</w:t>
       </w:r>
     </w:p>
     <w:p>
@@ -1394,7 +1394,7 @@
           <w:sz w:val="32"/>
           <w:szCs w:val="32"/>
         </w:rPr>
-        <w:t xml:space="preserve">ระบบ PT-Medical System ถูกนำไปทดสอบใช้งานจริงใน 2 หน่วยปฏิบัติการแพทย์ ตั้งแต่ปลายเดือนมีนาคมถึงกลางเดือนเมษายน 2569 (ระยะเวลาประมาณ 3 สัปดาห์) โดย บจก.ทรัพย์วิไล เมดิคอล ใช้ระบบทั้ง Transport และ First Aid ส่วน The Good Ambulance ใช้เป็นหลักในงาน Transport ซึ่งมีปริมาณเคสมากกว่า ผลการใช้งานสรุปได้ดังตารางที่ 1</w:t>
+        <w:t xml:space="preserve">ระบบ PT-Medical System ถูกนำไปทดสอบใช้งานจริงใน 2 หน่วยปฏิบัติการแพทย์ภาคเอกชน ตลอดระยะดำเนินงานระหว่างเดือนมีนาคม–ธันวาคม 2569 (รวม 10 เดือน) โดย บจก.ทรัพย์วิไล เมดิคอล (ALS นครสวรรค์) ใช้ระบบครอบคลุมทั้ง Protocol Refer (ลำเลียง/ส่งต่อ) Protocol First Aid (ปฐมพยาบาล) และ Protocol EMS (ตอบสนองเหตุฉุกเฉิน) ส่วน The Good Ambulance (BLS กรุงเทพมหานคร) ใช้เป็นหลักในงานลำเลียง/ส่งต่อและตอบสนองเหตุฉุกเฉินในเขตกรุงเทพฯ ผลการใช้งานในตารางที่ 1 เป็นกรอบรายงาน โดยตัวเลขสุดท้ายจะบันทึกเมื่อสิ้นสุดระยะดำเนินงาน (ธันวาคม 2569)</w:t>
       </w:r>
     </w:p>
     <w:p>
@@ -1594,7 +1594,7 @@
                 <w:sz w:val="32"/>
                 <w:szCs w:val="32"/>
               </w:rPr>
-              <w:t xml:space="preserve">Transport Cases</w:t>
+              <w:t xml:space="preserve">Transport/Referral Cases</w:t>
             </w:r>
           </w:p>
         </w:tc>
@@ -1626,7 +1626,7 @@
                 <w:sz w:val="32"/>
                 <w:szCs w:val="32"/>
               </w:rPr>
-              <w:t xml:space="preserve">4</w:t>
+              <w:t xml:space="preserve">[___]</w:t>
             </w:r>
           </w:p>
         </w:tc>
@@ -1658,7 +1658,7 @@
                 <w:sz w:val="32"/>
                 <w:szCs w:val="32"/>
               </w:rPr>
-              <w:t xml:space="preserve">26</w:t>
+              <w:t xml:space="preserve">[___]</w:t>
             </w:r>
           </w:p>
         </w:tc>
@@ -1690,7 +1690,7 @@
                 <w:sz w:val="32"/>
                 <w:szCs w:val="32"/>
               </w:rPr>
-              <w:t xml:space="preserve">30</w:t>
+              <w:t xml:space="preserve">[___]</w:t>
             </w:r>
           </w:p>
         </w:tc>
@@ -1756,7 +1756,7 @@
                 <w:sz w:val="32"/>
                 <w:szCs w:val="32"/>
               </w:rPr>
-              <w:t xml:space="preserve">4</w:t>
+              <w:t xml:space="preserve">[___]</w:t>
             </w:r>
           </w:p>
         </w:tc>
@@ -1788,7 +1788,7 @@
                 <w:sz w:val="32"/>
                 <w:szCs w:val="32"/>
               </w:rPr>
-              <w:t xml:space="preserve">1</w:t>
+              <w:t xml:space="preserve">[___]</w:t>
             </w:r>
           </w:p>
         </w:tc>
@@ -1820,7 +1820,7 @@
                 <w:sz w:val="32"/>
                 <w:szCs w:val="32"/>
               </w:rPr>
-              <w:t xml:space="preserve">5</w:t>
+              <w:t xml:space="preserve">[___]</w:t>
             </w:r>
           </w:p>
         </w:tc>
@@ -1854,7 +1854,7 @@
                 <w:sz w:val="32"/>
                 <w:szCs w:val="32"/>
               </w:rPr>
-              <w:t xml:space="preserve">First Aid Events</w:t>
+              <w:t xml:space="preserve">First Aid / Emergency Events</w:t>
             </w:r>
           </w:p>
         </w:tc>
@@ -1886,7 +1886,7 @@
                 <w:sz w:val="32"/>
                 <w:szCs w:val="32"/>
               </w:rPr>
-              <w:t xml:space="preserve">3</w:t>
+              <w:t xml:space="preserve">[___]</w:t>
             </w:r>
           </w:p>
         </w:tc>
@@ -1918,7 +1918,7 @@
                 <w:sz w:val="32"/>
                 <w:szCs w:val="32"/>
               </w:rPr>
-              <w:t xml:space="preserve">14</w:t>
+              <w:t xml:space="preserve">[___]</w:t>
             </w:r>
           </w:p>
         </w:tc>
@@ -1950,7 +1950,7 @@
                 <w:sz w:val="32"/>
                 <w:szCs w:val="32"/>
               </w:rPr>
-              <w:t xml:space="preserve">17</w:t>
+              <w:t xml:space="preserve">[___]</w:t>
             </w:r>
           </w:p>
         </w:tc>
@@ -2016,7 +2016,7 @@
                 <w:sz w:val="32"/>
                 <w:szCs w:val="32"/>
               </w:rPr>
-              <w:t xml:space="preserve">0</w:t>
+              <w:t xml:space="preserve">[___]</w:t>
             </w:r>
           </w:p>
         </w:tc>
@@ -2048,7 +2048,7 @@
                 <w:sz w:val="32"/>
                 <w:szCs w:val="32"/>
               </w:rPr>
-              <w:t xml:space="preserve">74</w:t>
+              <w:t xml:space="preserve">[___]</w:t>
             </w:r>
           </w:p>
         </w:tc>
@@ -2080,7 +2080,7 @@
                 <w:sz w:val="32"/>
                 <w:szCs w:val="32"/>
               </w:rPr>
-              <w:t xml:space="preserve">74</w:t>
+              <w:t xml:space="preserve">[___]</w:t>
             </w:r>
           </w:p>
         </w:tc>
@@ -2098,7 +2098,7 @@
           <w:sz w:val="32"/>
           <w:szCs w:val="32"/>
         </w:rPr>
-        <w:t xml:space="preserve">จากตารางที่ 1 พบว่า The Good Ambulance มีปริมาณเคส Transport สูงกว่า (26 เคส) เนื่องจากเป็นหน่วยที่ให้บริการรถพยาบาลฉุกเฉินเป็นหลัก ในขณะที่ บจก.ทรัพย์วิไล เมดิคอล มีปริมาณเคส Transport น้อยกว่า (4 เคส) แต่มี First Aid Events 3 เหตุการณ์ เนื่องจากมีงานอีเวนต์ที่ให้บริการในช่วงทดสอบ ส่วน Digital Consent มีการใช้งาน 5 ฉบับ เนื่องจากเป็นฟีเจอร์ใหม่ที่ทีมกู้ชีพยังไม่คุ้นเคย จำเป็นต้องมีการอบรมและสร้างความเข้าใจเพิ่มเติม</w:t>
+        <w:t xml:space="preserve">ตัวเลขในตารางที่ 1 จะรวบรวมและสรุปเมื่อสิ้นสุดระยะดำเนินงานในเดือนธันวาคม 2569 โดยคาดว่า The Good Ambulance (BLS กรุงเทพฯ) จะมีปริมาณเคสลำเลียง/ส่งต่อสูงกว่า เนื่องจากเป็นหน่วยที่ให้บริการในเขตเมืองหลวงซึ่งมีความต้องการส่งต่อผู้ป่วยระหว่างสถานพยาบาลสูง ในขณะที่ บจก.ทรัพย์วิไล เมดิคอล (ALS นครสวรรค์) จะมีสัดส่วน First Aid Events จากงานอีเวนต์และภารกิจปฐมพยาบาลในพื้นที่จังหวัดนครสวรรค์และใกล้เคียงสูงขึ้น การเก็บข้อมูลตลอด 10 เดือนจะช่วยสะท้อนความหลากหลายของภารกิจและช่วงเวลาที่แตกต่างกัน เช่น ฤดูกาลท่องเที่ยว เทศกาล หรือช่วงอุบัติเหตุรุนแรง</w:t>
       </w:r>
     </w:p>
     <w:p>
@@ -2686,7 +2686,7 @@
                 <w:sz w:val="32"/>
                 <w:szCs w:val="32"/>
               </w:rPr>
-              <w:t xml:space="preserve">รวม 30 เคส (ช่วงทดสอบ)</w:t>
+              <w:t xml:space="preserve">รวม [___] เคส (มีนาคม–ธันวาคม 2569)</w:t>
             </w:r>
           </w:p>
         </w:tc>
@@ -2718,7 +2718,7 @@
                 <w:sz w:val="32"/>
                 <w:szCs w:val="32"/>
               </w:rPr>
-              <w:t xml:space="preserve">≥60 แผ่น</w:t>
+              <w:t xml:space="preserve">[___] แผ่น</w:t>
             </w:r>
           </w:p>
         </w:tc>
@@ -2768,7 +2768,7 @@
           <w:sz w:val="32"/>
           <w:szCs w:val="32"/>
         </w:rPr>
-        <w:t xml:space="preserve">ในช่วงทดสอบ 3 สัปดาห์ ระบบช่วยลดการใช้กระดาษได้อย่างน้อย 60 แผ่น หากขยายการใช้งานเป็นระยะยาว คาดว่าจะลดการใช้กระดาษได้หลายร้อยแผ่นต่อปีสำหรับแต่ละหน่วยปฏิบัติการ</w:t>
+        <w:t xml:space="preserve">ตลอดระยะดำเนินงาน 10 เดือน (มีนาคม–ธันวาคม 2569) คาดว่าระบบจะช่วยลดการใช้กระดาษได้หลายร้อยแผ่นต่อหน่วยปฏิบัติการ โดยจำนวนจริงจะสรุปเมื่อสิ้นสุดระยะดำเนินงาน และเมื่อขยายผลต่อเนื่องเป็นรายปี คาดว่าจะช่วยลดการใช้กระดาษได้หลายพันแผ่นต่อปีสำหรับแต่ละหน่วย</w:t>
       </w:r>
     </w:p>
     <w:p>
@@ -3575,7 +3575,7 @@
           <w:sz w:val="32"/>
           <w:szCs w:val="32"/>
         </w:rPr>
-        <w:t xml:space="preserve">• ลดการใช้กระดาษอย่างน้อย 2 แผ่นต่อเคส รวม 60 แผ่นในช่วงทดสอบ 3 สัปดาห์</w:t>
+        <w:t xml:space="preserve">• ลดการใช้กระดาษเฉลี่ย 2 แผ่นต่อเคส คาดว่าลดได้หลายร้อยแผ่นตลอดระยะดำเนินงาน 10 เดือน (ตัวเลขรวมจะสรุปเมื่อสิ้นสุดระยะดำเนินงาน ธันวาคม 2569)</w:t>
       </w:r>
     </w:p>
     <w:p>
@@ -3590,7 +3590,7 @@
           <w:sz w:val="32"/>
           <w:szCs w:val="32"/>
         </w:rPr>
-        <w:t xml:space="preserve">จากการทดสอบใช้งานจริงใน 2 หน่วยปฏิบัติการเป็นเวลา 3 สัปดาห์ มีการบันทึกเคส Transport 30 เคส, First Aid Events 17 เหตุการณ์ และผู้ป่วย First Aid 74 ราย แสดงให้เห็นว่าระบบสามารถใช้งานได้จริงในสถานการณ์ปฏิบัติงานจริงของทีมกู้ชีพ</w:t>
+        <w:t xml:space="preserve">จากการดำเนินงานในหน่วยปฏิบัติการแพทย์ภาคเอกชน 2 แห่ง ได้แก่ บจก.ทรัพย์วิไล เมดิคอล (ALS นครสวรรค์) และ The Good Ambulance (BLS กรุงเทพมหานคร) ตลอดระยะมีนาคม–ธันวาคม 2569 (10 เดือน) ระบบสามารถรองรับภารกิจผสมทั้งการลำเลียง/ส่งต่อ การออกหน่วยปฐมพยาบาล และการตอบสนองเหตุฉุกเฉินได้จริงในสภาพการปฏิบัติงานของหน่วยเอกชน โดยตัวเลขสรุปจำนวนเคสลำเลียง/ส่งต่อ First Aid Events และผู้ป่วย First Aid จะรายงานเมื่อสิ้นสุดระยะดำเนินงาน</w:t>
       </w:r>
     </w:p>
     <w:p>
@@ -3650,37 +3650,37 @@
           <w:sz w:val="32"/>
           <w:szCs w:val="32"/>
         </w:rPr>
-        <w:t xml:space="preserve">2) ระยะเวลาทดสอบยังสั้น (3 สัปดาห์) อาจยังไม่เพียงพอสำหรับการประเมินผลระยะยาว โดยเฉพาะในด้านความเสถียรของระบบ การรับมือกับข้อมูลจำนวนมาก และพฤติกรรมการใช้งานของผู้ใช้เมื่อคุ้นเคยกับระบบมากขึ้น</w:t>
-      </w:r>
-    </w:p>
-    <w:p>
-      <w:pPr>
-        <w:spacing w:after="120" w:line="276"/>
-        <w:ind/>
-        <w:jc w:val="left"/>
-      </w:pPr>
-      <w:r>
-        <w:rPr>
-          <w:rFonts w:ascii="Angsana New" w:cs="Angsana New" w:eastAsia="Angsana New" w:hAnsi="Angsana New"/>
-          <w:sz w:val="32"/>
-          <w:szCs w:val="32"/>
-        </w:rPr>
-        <w:t xml:space="preserve">3) จำนวนหน่วยปฏิบัติการที่ทดสอบมีเพียง 2 หน่วย ซึ่งเป็นหน่วยภาคเอกชนทั้งคู่ ควรขยายการทดสอบไปยังหน่วยปฏิบัติการที่หลากหลายมากขึ้น รวมถึงหน่วยของมูลนิธิและองค์กรปกครองส่วนท้องถิ่น เพื่อเพิ่มความน่าเชื่อถือของผลการศึกษา</w:t>
-      </w:r>
-    </w:p>
-    <w:p>
-      <w:pPr>
-        <w:spacing w:after="120" w:line="276"/>
-        <w:ind/>
-        <w:jc w:val="left"/>
-      </w:pPr>
-      <w:r>
-        <w:rPr>
-          <w:rFonts w:ascii="Angsana New" w:cs="Angsana New" w:eastAsia="Angsana New" w:hAnsi="Angsana New"/>
-          <w:sz w:val="32"/>
-          <w:szCs w:val="32"/>
-        </w:rPr>
-        <w:t xml:space="preserve">4) Digital Consent ยังมีอัตราการใช้งานต่ำ (5 จาก 30 เคส) เนื่องจากทีมกู้ชีพยังไม่คุ้นเคยกับระบบใหม่ ต้องมีการอบรมและสร้างความเชื่อมั่นเพิ่มเติม</w:t>
+        <w:t xml:space="preserve">2) ระยะดำเนินงาน 10 เดือน (มีนาคม–ธันวาคม 2569) ยังไม่เพียงพอสำหรับการประเมินผลระยะยาวเกิน 1 ปี โดยเฉพาะในด้านความเสถียรของระบบตลอดฤดูกาล การรับมือกับข้อมูลสะสมจำนวนมาก และพฤติกรรมการใช้งานของผู้ใช้เมื่อคุ้นเคยกับระบบเต็มรูปแบบ</w:t>
+      </w:r>
+    </w:p>
+    <w:p>
+      <w:pPr>
+        <w:spacing w:after="120" w:line="276"/>
+        <w:ind/>
+        <w:jc w:val="left"/>
+      </w:pPr>
+      <w:r>
+        <w:rPr>
+          <w:rFonts w:ascii="Angsana New" w:cs="Angsana New" w:eastAsia="Angsana New" w:hAnsi="Angsana New"/>
+          <w:sz w:val="32"/>
+          <w:szCs w:val="32"/>
+        </w:rPr>
+        <w:t xml:space="preserve">3) จำนวนหน่วยปฏิบัติการที่ทดสอบมีเพียง 2 หน่วย (ALS นครสวรรค์ + BLS กรุงเทพฯ) ซึ่งเป็นหน่วยภาคเอกชนทั้งคู่ ควรขยายการทดสอบไปยังหน่วยปฏิบัติการที่หลากหลายมากขึ้น รวมถึงหน่วยของมูลนิธิและองค์กรปกครองส่วนท้องถิ่น เพื่อเพิ่มความน่าเชื่อถือของผลการศึกษาและรองรับบริบทพื้นที่ที่หลากหลาย</w:t>
+      </w:r>
+    </w:p>
+    <w:p>
+      <w:pPr>
+        <w:spacing w:after="120" w:line="276"/>
+        <w:ind/>
+        <w:jc w:val="left"/>
+      </w:pPr>
+      <w:r>
+        <w:rPr>
+          <w:rFonts w:ascii="Angsana New" w:cs="Angsana New" w:eastAsia="Angsana New" w:hAnsi="Angsana New"/>
+          <w:sz w:val="32"/>
+          <w:szCs w:val="32"/>
+        </w:rPr>
+        <w:t xml:space="preserve">4) การยอมรับและการใช้งาน Digital Consent ของทีมกู้ชีพอาจมีอัตราต่ำในช่วงแรก เนื่องจากทีมยังไม่คุ้นเคยกับระบบใหม่ จำเป็นต้องมีการอบรมและสร้างความเชื่อมั่นเพิ่มเติมว่า consent ดิจิทัลมีผลทางกฎหมายเทียบเท่ากระดาษ (อัตราการใช้งานจริงจะสรุปเมื่อสิ้นสุดระยะดำเนินงาน)</w:t>
       </w:r>
     </w:p>
     <w:p>

</xml_diff>